<commit_message>
feat: control documental ISO 21001, estandarizacion de formato minimo institucional y versionado sincronizado
</commit_message>
<xml_diff>
--- a/backend/templates/Plantilla_CBL_Modular.docx
+++ b/backend/templates/Plantilla_CBL_Modular.docx
@@ -8,6 +8,7 @@
       </w:pPr>
       <w:r>
         <w:rPr>
+          <w:rFonts w:ascii="Arial" w:hAnsi="Arial"/>
           <w:b/>
           <w:color w:val="B45309"/>
           <w:sz w:val="17"/>
@@ -17,22 +18,26 @@
       </w:r>
       <w:r>
         <w:rPr>
+          <w:rFonts w:ascii="Arial" w:hAnsi="Arial"/>
           <w:b/>
-          <w:color w:val="0F172A"/>
+          <w:color w:val="1A3A5C"/>
           <w:sz w:val="32"/>
         </w:rPr>
         <w:t>PLAN DE APRENDIZAJE MODULAR POR COMPETENCIAS (CBL)</w:t>
       </w:r>
     </w:p>
-    <w:p/>
     <w:p>
+      <w:pPr>
+        <w:jc w:val="center"/>
+      </w:pPr>
       <w:r>
         <w:rPr>
-          <w:b/>
-          <w:color w:val="1E293B"/>
-          <w:sz w:val="22"/>
+          <w:rFonts w:ascii="Arial" w:hAnsi="Arial"/>
+          <w:i/>
+          <w:color w:val="64748B"/>
+          <w:sz w:val="18"/>
         </w:rPr>
-        <w:t>1. DATOS GENERALES DEL MÓDULO</w:t>
+        <w:t>Diseño Curricular Inverso (UbD) • Evidencias Auténticas • Enfoque Inclusivo DUA • ISO 21001:2018</w:t>
       </w:r>
     </w:p>
     <w:tbl>
@@ -43,20 +48,236 @@
         <w:tblLook w:firstColumn="1" w:firstRow="1" w:lastColumn="0" w:lastRow="0" w:noHBand="0" w:noVBand="1" w:val="04A0"/>
       </w:tblPr>
       <w:tblGrid>
-        <w:gridCol w:w="2340"/>
-        <w:gridCol w:w="2340"/>
-        <w:gridCol w:w="2340"/>
-        <w:gridCol w:w="2340"/>
+        <w:gridCol w:w="4968"/>
+        <w:gridCol w:w="4968"/>
       </w:tblGrid>
       <w:tr>
         <w:tc>
           <w:tcPr>
-            <w:tcW w:type="dxa" w:w="2340"/>
+            <w:tcW w:type="dxa" w:w="4968"/>
             <w:tcMar>
-              <w:top w:w="100" w:type="dxa"/>
-              <w:bottom w:w="100" w:type="dxa"/>
-              <w:left w:w="120" w:type="dxa"/>
-              <w:right w:w="120" w:type="dxa"/>
+              <w:top w:w="60" w:type="dxa"/>
+              <w:bottom w:w="60" w:type="dxa"/>
+              <w:left w:w="100" w:type="dxa"/>
+              <w:right w:w="100" w:type="dxa"/>
+            </w:tcMar>
+            <w:shd w:fill="F1F5F9"/>
+          </w:tcPr>
+          <w:p>
+            <w:r>
+              <w:rPr>
+                <w:rFonts w:ascii="Arial" w:hAnsi="Arial"/>
+                <w:b/>
+                <w:color w:val="1E293B"/>
+                <w:sz w:val="17"/>
+              </w:rPr>
+              <w:t>Código Institucional:</w:t>
+            </w:r>
+          </w:p>
+        </w:tc>
+        <w:tc>
+          <w:tcPr>
+            <w:tcW w:type="dxa" w:w="4968"/>
+            <w:tcMar>
+              <w:top w:w="60" w:type="dxa"/>
+              <w:bottom w:w="60" w:type="dxa"/>
+              <w:left w:w="100" w:type="dxa"/>
+              <w:right w:w="100" w:type="dxa"/>
+            </w:tcMar>
+            <w:shd w:fill="FFFFFF"/>
+          </w:tcPr>
+          <w:p>
+            <w:r>
+              <w:rPr>
+                <w:rFonts w:ascii="Arial" w:hAnsi="Arial"/>
+                <w:b/>
+                <w:color w:val="1A3A5C"/>
+                <w:sz w:val="17"/>
+              </w:rPr>
+              <w:t>DOC-DIR-CP2-PDC-[[CODIGO_MODULO]]</w:t>
+            </w:r>
+          </w:p>
+        </w:tc>
+      </w:tr>
+      <w:tr>
+        <w:tc>
+          <w:tcPr>
+            <w:tcW w:type="dxa" w:w="4968"/>
+            <w:tcMar>
+              <w:top w:w="60" w:type="dxa"/>
+              <w:bottom w:w="60" w:type="dxa"/>
+              <w:left w:w="100" w:type="dxa"/>
+              <w:right w:w="100" w:type="dxa"/>
+            </w:tcMar>
+            <w:shd w:fill="F1F5F9"/>
+          </w:tcPr>
+          <w:p>
+            <w:r>
+              <w:rPr>
+                <w:rFonts w:ascii="Arial" w:hAnsi="Arial"/>
+                <w:b/>
+                <w:color w:val="1E293B"/>
+                <w:sz w:val="17"/>
+              </w:rPr>
+              <w:t>Versión Documental Vigente:</w:t>
+            </w:r>
+          </w:p>
+        </w:tc>
+        <w:tc>
+          <w:tcPr>
+            <w:tcW w:type="dxa" w:w="4968"/>
+            <w:tcMar>
+              <w:top w:w="60" w:type="dxa"/>
+              <w:bottom w:w="60" w:type="dxa"/>
+              <w:left w:w="100" w:type="dxa"/>
+              <w:right w:w="100" w:type="dxa"/>
+            </w:tcMar>
+            <w:shd w:fill="FFFFFF"/>
+          </w:tcPr>
+          <w:p>
+            <w:r>
+              <w:rPr>
+                <w:rFonts w:ascii="Arial" w:hAnsi="Arial"/>
+                <w:b w:val="0"/>
+                <w:color w:val="0F172A"/>
+                <w:sz w:val="17"/>
+              </w:rPr>
+              <w:t>1.0 (Oficial Aprobado)</w:t>
+            </w:r>
+          </w:p>
+        </w:tc>
+      </w:tr>
+      <w:tr>
+        <w:tc>
+          <w:tcPr>
+            <w:tcW w:type="dxa" w:w="4968"/>
+            <w:tcMar>
+              <w:top w:w="60" w:type="dxa"/>
+              <w:bottom w:w="60" w:type="dxa"/>
+              <w:left w:w="100" w:type="dxa"/>
+              <w:right w:w="100" w:type="dxa"/>
+            </w:tcMar>
+            <w:shd w:fill="F1F5F9"/>
+          </w:tcPr>
+          <w:p>
+            <w:r>
+              <w:rPr>
+                <w:rFonts w:ascii="Arial" w:hAnsi="Arial"/>
+                <w:b/>
+                <w:color w:val="1E293B"/>
+                <w:sz w:val="17"/>
+              </w:rPr>
+              <w:t>Marco Normativo / Sistema:</w:t>
+            </w:r>
+          </w:p>
+        </w:tc>
+        <w:tc>
+          <w:tcPr>
+            <w:tcW w:type="dxa" w:w="4968"/>
+            <w:tcMar>
+              <w:top w:w="60" w:type="dxa"/>
+              <w:bottom w:w="60" w:type="dxa"/>
+              <w:left w:w="100" w:type="dxa"/>
+              <w:right w:w="100" w:type="dxa"/>
+            </w:tcMar>
+            <w:shd w:fill="FFFFFF"/>
+          </w:tcPr>
+          <w:p>
+            <w:r>
+              <w:rPr>
+                <w:rFonts w:ascii="Arial" w:hAnsi="Arial"/>
+                <w:b w:val="0"/>
+                <w:color w:val="0F172A"/>
+                <w:sz w:val="17"/>
+              </w:rPr>
+              <w:t>ISO 21001:2018 (EOMS) Cláusula 7.5 • Información Documentada</w:t>
+            </w:r>
+          </w:p>
+        </w:tc>
+      </w:tr>
+      <w:tr>
+        <w:tc>
+          <w:tcPr>
+            <w:tcW w:type="dxa" w:w="4968"/>
+            <w:tcMar>
+              <w:top w:w="60" w:type="dxa"/>
+              <w:bottom w:w="60" w:type="dxa"/>
+              <w:left w:w="100" w:type="dxa"/>
+              <w:right w:w="100" w:type="dxa"/>
+            </w:tcMar>
+            <w:shd w:fill="F1F5F9"/>
+          </w:tcPr>
+          <w:p>
+            <w:r>
+              <w:rPr>
+                <w:rFonts w:ascii="Arial" w:hAnsi="Arial"/>
+                <w:b/>
+                <w:color w:val="1E293B"/>
+                <w:sz w:val="17"/>
+              </w:rPr>
+              <w:t>Vigencia Académica:</w:t>
+            </w:r>
+          </w:p>
+        </w:tc>
+        <w:tc>
+          <w:tcPr>
+            <w:tcW w:type="dxa" w:w="4968"/>
+            <w:tcMar>
+              <w:top w:w="60" w:type="dxa"/>
+              <w:bottom w:w="60" w:type="dxa"/>
+              <w:left w:w="100" w:type="dxa"/>
+              <w:right w:w="100" w:type="dxa"/>
+            </w:tcMar>
+            <w:shd w:fill="FFFFFF"/>
+          </w:tcPr>
+          <w:p>
+            <w:r>
+              <w:rPr>
+                <w:rFonts w:ascii="Arial" w:hAnsi="Arial"/>
+                <w:b w:val="0"/>
+                <w:color w:val="0F172A"/>
+                <w:sz w:val="17"/>
+              </w:rPr>
+              <w:t>[[PERIODO_MODULO]] • Semestre Académico Oficial</w:t>
+            </w:r>
+          </w:p>
+        </w:tc>
+      </w:tr>
+    </w:tbl>
+    <w:p/>
+    <w:p>
+      <w:r>
+        <w:rPr>
+          <w:rFonts w:ascii="Arial" w:hAnsi="Arial"/>
+          <w:b/>
+          <w:color w:val="1E293B"/>
+          <w:sz w:val="22"/>
+        </w:rPr>
+        <w:t>1. DATOS GENERALES DEL MÓDULO Y DISTRIBUCIÓN HORARIA</w:t>
+      </w:r>
+    </w:p>
+    <w:tbl>
+      <w:tblPr>
+        <w:tblW w:type="auto" w:w="0"/>
+        <w:jc w:val="center"/>
+        <w:tblLayout w:type="fixed"/>
+        <w:tblLook w:firstColumn="1" w:firstRow="1" w:lastColumn="0" w:lastRow="0" w:noHBand="0" w:noVBand="1" w:val="04A0"/>
+      </w:tblPr>
+      <w:tblGrid>
+        <w:gridCol w:w="2484"/>
+        <w:gridCol w:w="2484"/>
+        <w:gridCol w:w="2484"/>
+        <w:gridCol w:w="2484"/>
+      </w:tblGrid>
+      <w:tr>
+        <w:tc>
+          <w:tcPr>
+            <w:tcW w:type="dxa" w:w="2484"/>
+            <w:tcMar>
+              <w:top w:w="80" w:type="dxa"/>
+              <w:bottom w:w="80" w:type="dxa"/>
+              <w:left w:w="100" w:type="dxa"/>
+              <w:right w:w="100" w:type="dxa"/>
             </w:tcMar>
             <w:shd w:fill="F1F5F9"/>
           </w:tcPr>
@@ -66,9 +287,10 @@
             </w:pPr>
             <w:r>
               <w:rPr>
+                <w:rFonts w:ascii="Arial" w:hAnsi="Arial"/>
                 <w:b/>
                 <w:color w:val="1E293B"/>
-                <w:sz w:val="19"/>
+                <w:sz w:val="17"/>
               </w:rPr>
               <w:t>Código:</w:t>
             </w:r>
@@ -76,12 +298,12 @@
         </w:tc>
         <w:tc>
           <w:tcPr>
-            <w:tcW w:type="dxa" w:w="2340"/>
+            <w:tcW w:type="dxa" w:w="2484"/>
             <w:tcMar>
-              <w:top w:w="100" w:type="dxa"/>
-              <w:bottom w:w="100" w:type="dxa"/>
-              <w:left w:w="120" w:type="dxa"/>
-              <w:right w:w="120" w:type="dxa"/>
+              <w:top w:w="80" w:type="dxa"/>
+              <w:bottom w:w="80" w:type="dxa"/>
+              <w:left w:w="100" w:type="dxa"/>
+              <w:right w:w="100" w:type="dxa"/>
             </w:tcMar>
             <w:shd w:fill="FFFFFF"/>
           </w:tcPr>
@@ -91,8 +313,9 @@
             </w:pPr>
             <w:r>
               <w:rPr>
+                <w:rFonts w:ascii="Arial" w:hAnsi="Arial"/>
                 <w:color w:val="0F172A"/>
-                <w:sz w:val="19"/>
+                <w:sz w:val="17"/>
               </w:rPr>
               <w:t>[[CODIGO_MODULO]]</w:t>
             </w:r>
@@ -100,12 +323,12 @@
         </w:tc>
         <w:tc>
           <w:tcPr>
-            <w:tcW w:type="dxa" w:w="2340"/>
+            <w:tcW w:type="dxa" w:w="2484"/>
             <w:tcMar>
-              <w:top w:w="100" w:type="dxa"/>
-              <w:bottom w:w="100" w:type="dxa"/>
-              <w:left w:w="120" w:type="dxa"/>
-              <w:right w:w="120" w:type="dxa"/>
+              <w:top w:w="80" w:type="dxa"/>
+              <w:bottom w:w="80" w:type="dxa"/>
+              <w:left w:w="100" w:type="dxa"/>
+              <w:right w:w="100" w:type="dxa"/>
             </w:tcMar>
             <w:shd w:fill="F1F5F9"/>
           </w:tcPr>
@@ -115,9 +338,10 @@
             </w:pPr>
             <w:r>
               <w:rPr>
+                <w:rFonts w:ascii="Arial" w:hAnsi="Arial"/>
                 <w:b/>
                 <w:color w:val="1E293B"/>
-                <w:sz w:val="19"/>
+                <w:sz w:val="17"/>
               </w:rPr>
               <w:t>Asignatura / Módulo:</w:t>
             </w:r>
@@ -125,12 +349,12 @@
         </w:tc>
         <w:tc>
           <w:tcPr>
-            <w:tcW w:type="dxa" w:w="2340"/>
+            <w:tcW w:type="dxa" w:w="2484"/>
             <w:tcMar>
-              <w:top w:w="100" w:type="dxa"/>
-              <w:bottom w:w="100" w:type="dxa"/>
-              <w:left w:w="120" w:type="dxa"/>
-              <w:right w:w="120" w:type="dxa"/>
+              <w:top w:w="80" w:type="dxa"/>
+              <w:bottom w:w="80" w:type="dxa"/>
+              <w:left w:w="100" w:type="dxa"/>
+              <w:right w:w="100" w:type="dxa"/>
             </w:tcMar>
             <w:shd w:fill="FFFFFF"/>
           </w:tcPr>
@@ -140,8 +364,9 @@
             </w:pPr>
             <w:r>
               <w:rPr>
+                <w:rFonts w:ascii="Arial" w:hAnsi="Arial"/>
                 <w:color w:val="0F172A"/>
-                <w:sz w:val="19"/>
+                <w:sz w:val="17"/>
               </w:rPr>
               <w:t>[[NOMBRE_MODULO]]</w:t>
             </w:r>
@@ -151,12 +376,12 @@
       <w:tr>
         <w:tc>
           <w:tcPr>
-            <w:tcW w:type="dxa" w:w="2340"/>
+            <w:tcW w:type="dxa" w:w="2484"/>
             <w:tcMar>
-              <w:top w:w="100" w:type="dxa"/>
-              <w:bottom w:w="100" w:type="dxa"/>
-              <w:left w:w="120" w:type="dxa"/>
-              <w:right w:w="120" w:type="dxa"/>
+              <w:top w:w="80" w:type="dxa"/>
+              <w:bottom w:w="80" w:type="dxa"/>
+              <w:left w:w="100" w:type="dxa"/>
+              <w:right w:w="100" w:type="dxa"/>
             </w:tcMar>
             <w:shd w:fill="F1F5F9"/>
           </w:tcPr>
@@ -166,9 +391,10 @@
             </w:pPr>
             <w:r>
               <w:rPr>
+                <w:rFonts w:ascii="Arial" w:hAnsi="Arial"/>
                 <w:b/>
                 <w:color w:val="1E293B"/>
-                <w:sz w:val="19"/>
+                <w:sz w:val="17"/>
               </w:rPr>
               <w:t>Docente Titular:</w:t>
             </w:r>
@@ -176,12 +402,12 @@
         </w:tc>
         <w:tc>
           <w:tcPr>
-            <w:tcW w:type="dxa" w:w="2340"/>
+            <w:tcW w:type="dxa" w:w="2484"/>
             <w:tcMar>
-              <w:top w:w="100" w:type="dxa"/>
-              <w:bottom w:w="100" w:type="dxa"/>
-              <w:left w:w="120" w:type="dxa"/>
-              <w:right w:w="120" w:type="dxa"/>
+              <w:top w:w="80" w:type="dxa"/>
+              <w:bottom w:w="80" w:type="dxa"/>
+              <w:left w:w="100" w:type="dxa"/>
+              <w:right w:w="100" w:type="dxa"/>
             </w:tcMar>
             <w:shd w:fill="FFFFFF"/>
           </w:tcPr>
@@ -191,8 +417,9 @@
             </w:pPr>
             <w:r>
               <w:rPr>
+                <w:rFonts w:ascii="Arial" w:hAnsi="Arial"/>
                 <w:color w:val="0F172A"/>
-                <w:sz w:val="19"/>
+                <w:sz w:val="17"/>
               </w:rPr>
               <w:t>[[DOCENTE]]</w:t>
             </w:r>
@@ -200,12 +427,12 @@
         </w:tc>
         <w:tc>
           <w:tcPr>
-            <w:tcW w:type="dxa" w:w="2340"/>
+            <w:tcW w:type="dxa" w:w="2484"/>
             <w:tcMar>
-              <w:top w:w="100" w:type="dxa"/>
-              <w:bottom w:w="100" w:type="dxa"/>
-              <w:left w:w="120" w:type="dxa"/>
-              <w:right w:w="120" w:type="dxa"/>
+              <w:top w:w="80" w:type="dxa"/>
+              <w:bottom w:w="80" w:type="dxa"/>
+              <w:left w:w="100" w:type="dxa"/>
+              <w:right w:w="100" w:type="dxa"/>
             </w:tcMar>
             <w:shd w:fill="F1F5F9"/>
           </w:tcPr>
@@ -215,22 +442,23 @@
             </w:pPr>
             <w:r>
               <w:rPr>
+                <w:rFonts w:ascii="Arial" w:hAnsi="Arial"/>
                 <w:b/>
                 <w:color w:val="1E293B"/>
-                <w:sz w:val="19"/>
+                <w:sz w:val="17"/>
               </w:rPr>
-              <w:t>Carga Horaria:</w:t>
+              <w:t>Periodo / Módulo:</w:t>
             </w:r>
           </w:p>
         </w:tc>
         <w:tc>
           <w:tcPr>
-            <w:tcW w:type="dxa" w:w="2340"/>
+            <w:tcW w:type="dxa" w:w="2484"/>
             <w:tcMar>
-              <w:top w:w="100" w:type="dxa"/>
-              <w:bottom w:w="100" w:type="dxa"/>
-              <w:left w:w="120" w:type="dxa"/>
-              <w:right w:w="120" w:type="dxa"/>
+              <w:top w:w="80" w:type="dxa"/>
+              <w:bottom w:w="80" w:type="dxa"/>
+              <w:left w:w="100" w:type="dxa"/>
+              <w:right w:w="100" w:type="dxa"/>
             </w:tcMar>
             <w:shd w:fill="FFFFFF"/>
           </w:tcPr>
@@ -240,8 +468,113 @@
             </w:pPr>
             <w:r>
               <w:rPr>
+                <w:rFonts w:ascii="Arial" w:hAnsi="Arial"/>
                 <w:color w:val="0F172A"/>
-                <w:sz w:val="19"/>
+                <w:sz w:val="17"/>
+              </w:rPr>
+              <w:t>[[PERIODO_MODULO]]</w:t>
+            </w:r>
+          </w:p>
+        </w:tc>
+      </w:tr>
+      <w:tr>
+        <w:tc>
+          <w:tcPr>
+            <w:tcW w:type="dxa" w:w="2484"/>
+            <w:tcMar>
+              <w:top w:w="80" w:type="dxa"/>
+              <w:bottom w:w="80" w:type="dxa"/>
+              <w:left w:w="100" w:type="dxa"/>
+              <w:right w:w="100" w:type="dxa"/>
+            </w:tcMar>
+            <w:shd w:fill="F1F5F9"/>
+          </w:tcPr>
+          <w:p>
+            <w:pPr>
+              <w:jc w:val="left"/>
+            </w:pPr>
+            <w:r>
+              <w:rPr>
+                <w:rFonts w:ascii="Arial" w:hAnsi="Arial"/>
+                <w:b/>
+                <w:color w:val="1E293B"/>
+                <w:sz w:val="17"/>
+              </w:rPr>
+              <w:t>Modalidad:</w:t>
+            </w:r>
+          </w:p>
+        </w:tc>
+        <w:tc>
+          <w:tcPr>
+            <w:tcW w:type="dxa" w:w="2484"/>
+            <w:tcMar>
+              <w:top w:w="80" w:type="dxa"/>
+              <w:bottom w:w="80" w:type="dxa"/>
+              <w:left w:w="100" w:type="dxa"/>
+              <w:right w:w="100" w:type="dxa"/>
+            </w:tcMar>
+            <w:shd w:fill="FFFFFF"/>
+          </w:tcPr>
+          <w:p>
+            <w:pPr>
+              <w:jc w:val="left"/>
+            </w:pPr>
+            <w:r>
+              <w:rPr>
+                <w:rFonts w:ascii="Arial" w:hAnsi="Arial"/>
+                <w:color w:val="0F172A"/>
+                <w:sz w:val="17"/>
+              </w:rPr>
+              <w:t>[[MODALIDAD]]</w:t>
+            </w:r>
+          </w:p>
+        </w:tc>
+        <w:tc>
+          <w:tcPr>
+            <w:tcW w:type="dxa" w:w="2484"/>
+            <w:tcMar>
+              <w:top w:w="80" w:type="dxa"/>
+              <w:bottom w:w="80" w:type="dxa"/>
+              <w:left w:w="100" w:type="dxa"/>
+              <w:right w:w="100" w:type="dxa"/>
+            </w:tcMar>
+            <w:shd w:fill="F1F5F9"/>
+          </w:tcPr>
+          <w:p>
+            <w:pPr>
+              <w:jc w:val="left"/>
+            </w:pPr>
+            <w:r>
+              <w:rPr>
+                <w:rFonts w:ascii="Arial" w:hAnsi="Arial"/>
+                <w:b/>
+                <w:color w:val="1E293B"/>
+                <w:sz w:val="17"/>
+              </w:rPr>
+              <w:t>Carga Horaria Total:</w:t>
+            </w:r>
+          </w:p>
+        </w:tc>
+        <w:tc>
+          <w:tcPr>
+            <w:tcW w:type="dxa" w:w="2484"/>
+            <w:tcMar>
+              <w:top w:w="80" w:type="dxa"/>
+              <w:bottom w:w="80" w:type="dxa"/>
+              <w:left w:w="100" w:type="dxa"/>
+              <w:right w:w="100" w:type="dxa"/>
+            </w:tcMar>
+            <w:shd w:fill="FFFFFF"/>
+          </w:tcPr>
+          <w:p>
+            <w:pPr>
+              <w:jc w:val="left"/>
+            </w:pPr>
+            <w:r>
+              <w:rPr>
+                <w:rFonts w:ascii="Arial" w:hAnsi="Arial"/>
+                <w:color w:val="0F172A"/>
+                <w:sz w:val="17"/>
               </w:rPr>
               <w:t>[[DURACION_HORAS]]</w:t>
             </w:r>
@@ -251,12 +584,12 @@
       <w:tr>
         <w:tc>
           <w:tcPr>
-            <w:tcW w:type="dxa" w:w="2340"/>
+            <w:tcW w:type="dxa" w:w="2484"/>
             <w:tcMar>
-              <w:top w:w="100" w:type="dxa"/>
-              <w:bottom w:w="100" w:type="dxa"/>
-              <w:left w:w="120" w:type="dxa"/>
-              <w:right w:w="120" w:type="dxa"/>
+              <w:top w:w="80" w:type="dxa"/>
+              <w:bottom w:w="80" w:type="dxa"/>
+              <w:left w:w="100" w:type="dxa"/>
+              <w:right w:w="100" w:type="dxa"/>
             </w:tcMar>
             <w:shd w:fill="F1F5F9"/>
           </w:tcPr>
@@ -266,22 +599,23 @@
             </w:pPr>
             <w:r>
               <w:rPr>
+                <w:rFonts w:ascii="Arial" w:hAnsi="Arial"/>
                 <w:b/>
                 <w:color w:val="1E293B"/>
-                <w:sz w:val="19"/>
+                <w:sz w:val="17"/>
               </w:rPr>
-              <w:t>Periodo / Módulo:</w:t>
+              <w:t>Horas Presenciales/Sincrónicas:</w:t>
             </w:r>
           </w:p>
         </w:tc>
         <w:tc>
           <w:tcPr>
-            <w:tcW w:type="dxa" w:w="2340"/>
+            <w:tcW w:type="dxa" w:w="2484"/>
             <w:tcMar>
-              <w:top w:w="100" w:type="dxa"/>
-              <w:bottom w:w="100" w:type="dxa"/>
-              <w:left w:w="120" w:type="dxa"/>
-              <w:right w:w="120" w:type="dxa"/>
+              <w:top w:w="80" w:type="dxa"/>
+              <w:bottom w:w="80" w:type="dxa"/>
+              <w:left w:w="100" w:type="dxa"/>
+              <w:right w:w="100" w:type="dxa"/>
             </w:tcMar>
             <w:shd w:fill="FFFFFF"/>
           </w:tcPr>
@@ -291,21 +625,22 @@
             </w:pPr>
             <w:r>
               <w:rPr>
+                <w:rFonts w:ascii="Arial" w:hAnsi="Arial"/>
                 <w:color w:val="0F172A"/>
-                <w:sz w:val="19"/>
+                <w:sz w:val="17"/>
               </w:rPr>
-              <w:t>[[PERIODO_MODULO]]</w:t>
+              <w:t>[[HORAS_PRESENCIALES]]</w:t>
             </w:r>
           </w:p>
         </w:tc>
         <w:tc>
           <w:tcPr>
-            <w:tcW w:type="dxa" w:w="2340"/>
+            <w:tcW w:type="dxa" w:w="2484"/>
             <w:tcMar>
-              <w:top w:w="100" w:type="dxa"/>
-              <w:bottom w:w="100" w:type="dxa"/>
-              <w:left w:w="120" w:type="dxa"/>
-              <w:right w:w="120" w:type="dxa"/>
+              <w:top w:w="80" w:type="dxa"/>
+              <w:bottom w:w="80" w:type="dxa"/>
+              <w:left w:w="100" w:type="dxa"/>
+              <w:right w:w="100" w:type="dxa"/>
             </w:tcMar>
             <w:shd w:fill="F1F5F9"/>
           </w:tcPr>
@@ -315,22 +650,23 @@
             </w:pPr>
             <w:r>
               <w:rPr>
+                <w:rFonts w:ascii="Arial" w:hAnsi="Arial"/>
                 <w:b/>
                 <w:color w:val="1E293B"/>
-                <w:sz w:val="19"/>
+                <w:sz w:val="17"/>
               </w:rPr>
-              <w:t>Modalidad:</w:t>
+              <w:t>Horas Autónomas / Créditos:</w:t>
             </w:r>
           </w:p>
         </w:tc>
         <w:tc>
           <w:tcPr>
-            <w:tcW w:type="dxa" w:w="2340"/>
+            <w:tcW w:type="dxa" w:w="2484"/>
             <w:tcMar>
-              <w:top w:w="100" w:type="dxa"/>
-              <w:bottom w:w="100" w:type="dxa"/>
-              <w:left w:w="120" w:type="dxa"/>
-              <w:right w:w="120" w:type="dxa"/>
+              <w:top w:w="80" w:type="dxa"/>
+              <w:bottom w:w="80" w:type="dxa"/>
+              <w:left w:w="100" w:type="dxa"/>
+              <w:right w:w="100" w:type="dxa"/>
             </w:tcMar>
             <w:shd w:fill="FFFFFF"/>
           </w:tcPr>
@@ -340,10 +676,11 @@
             </w:pPr>
             <w:r>
               <w:rPr>
+                <w:rFonts w:ascii="Arial" w:hAnsi="Arial"/>
                 <w:color w:val="0F172A"/>
-                <w:sz w:val="19"/>
+                <w:sz w:val="17"/>
               </w:rPr>
-              <w:t>[[MODALIDAD]]</w:t>
+              <w:t>[[HORAS_AUTONOMAS]] • [[CREDITOS_SCT]]</w:t>
             </w:r>
           </w:p>
         </w:tc>
@@ -353,6 +690,7 @@
     <w:p>
       <w:r>
         <w:rPr>
+          <w:rFonts w:ascii="Arial" w:hAnsi="Arial"/>
           <w:b/>
           <w:color w:val="1E293B"/>
           <w:sz w:val="22"/>
@@ -368,48 +706,50 @@
         <w:tblLook w:firstColumn="1" w:firstRow="1" w:lastColumn="0" w:lastRow="0" w:noHBand="0" w:noVBand="1" w:val="04A0"/>
       </w:tblPr>
       <w:tblGrid>
-        <w:gridCol w:w="4680"/>
-        <w:gridCol w:w="4680"/>
+        <w:gridCol w:w="4968"/>
+        <w:gridCol w:w="4968"/>
       </w:tblGrid>
       <w:tr>
         <w:tc>
           <w:tcPr>
-            <w:tcW w:type="dxa" w:w="4680"/>
+            <w:tcW w:type="dxa" w:w="4968"/>
             <w:tcMar>
-              <w:top w:w="120" w:type="dxa"/>
-              <w:bottom w:w="120" w:type="dxa"/>
-              <w:left w:w="150" w:type="dxa"/>
-              <w:right w:w="150" w:type="dxa"/>
+              <w:top w:w="100" w:type="dxa"/>
+              <w:bottom w:w="100" w:type="dxa"/>
+              <w:left w:w="120" w:type="dxa"/>
+              <w:right w:w="120" w:type="dxa"/>
             </w:tcMar>
             <w:shd w:fill="F8FAFC"/>
           </w:tcPr>
           <w:p>
             <w:r>
               <w:rPr>
+                <w:rFonts w:ascii="Arial" w:hAnsi="Arial"/>
                 <w:b/>
                 <w:color w:val="1E293B"/>
-                <w:sz w:val="19"/>
+                <w:sz w:val="18"/>
               </w:rPr>
-              <w:t>Problema del Contexto:</w:t>
+              <w:t>Problema del Contexto Real:</w:t>
             </w:r>
           </w:p>
         </w:tc>
         <w:tc>
           <w:tcPr>
-            <w:tcW w:type="dxa" w:w="4680"/>
+            <w:tcW w:type="dxa" w:w="4968"/>
             <w:tcMar>
-              <w:top w:w="120" w:type="dxa"/>
-              <w:bottom w:w="120" w:type="dxa"/>
-              <w:left w:w="150" w:type="dxa"/>
-              <w:right w:w="150" w:type="dxa"/>
+              <w:top w:w="100" w:type="dxa"/>
+              <w:bottom w:w="100" w:type="dxa"/>
+              <w:left w:w="120" w:type="dxa"/>
+              <w:right w:w="120" w:type="dxa"/>
             </w:tcMar>
             <w:shd w:fill="FFFFFF"/>
           </w:tcPr>
           <w:p>
             <w:r>
               <w:rPr>
+                <w:rFonts w:ascii="Arial" w:hAnsi="Arial"/>
                 <w:color w:val="0F172A"/>
-                <w:sz w:val="19"/>
+                <w:sz w:val="18"/>
               </w:rPr>
               <w:t>[[PROBLEMA_CONTEXTO]]</w:t>
             </w:r>
@@ -419,21 +759,22 @@
       <w:tr>
         <w:tc>
           <w:tcPr>
-            <w:tcW w:type="dxa" w:w="4680"/>
+            <w:tcW w:type="dxa" w:w="4968"/>
             <w:tcMar>
-              <w:top w:w="120" w:type="dxa"/>
-              <w:bottom w:w="120" w:type="dxa"/>
-              <w:left w:w="150" w:type="dxa"/>
-              <w:right w:w="150" w:type="dxa"/>
+              <w:top w:w="100" w:type="dxa"/>
+              <w:bottom w:w="100" w:type="dxa"/>
+              <w:left w:w="120" w:type="dxa"/>
+              <w:right w:w="120" w:type="dxa"/>
             </w:tcMar>
             <w:shd w:fill="F8FAFC"/>
           </w:tcPr>
           <w:p>
             <w:r>
               <w:rPr>
+                <w:rFonts w:ascii="Arial" w:hAnsi="Arial"/>
                 <w:b/>
                 <w:color w:val="1E293B"/>
-                <w:sz w:val="19"/>
+                <w:sz w:val="18"/>
               </w:rPr>
               <w:t>Competencia Global del Módulo:</w:t>
             </w:r>
@@ -441,20 +782,21 @@
         </w:tc>
         <w:tc>
           <w:tcPr>
-            <w:tcW w:type="dxa" w:w="4680"/>
+            <w:tcW w:type="dxa" w:w="4968"/>
             <w:tcMar>
-              <w:top w:w="120" w:type="dxa"/>
-              <w:bottom w:w="120" w:type="dxa"/>
-              <w:left w:w="150" w:type="dxa"/>
-              <w:right w:w="150" w:type="dxa"/>
+              <w:top w:w="100" w:type="dxa"/>
+              <w:bottom w:w="100" w:type="dxa"/>
+              <w:left w:w="120" w:type="dxa"/>
+              <w:right w:w="120" w:type="dxa"/>
             </w:tcMar>
             <w:shd w:fill="FFFFFF"/>
           </w:tcPr>
           <w:p>
             <w:r>
               <w:rPr>
+                <w:rFonts w:ascii="Arial" w:hAnsi="Arial"/>
                 <w:color w:val="0F172A"/>
-                <w:sz w:val="19"/>
+                <w:sz w:val="18"/>
               </w:rPr>
               <w:t>[[COMPETENCIA_GLOBAL]]</w:t>
             </w:r>
@@ -466,6 +808,7 @@
     <w:p>
       <w:r>
         <w:rPr>
+          <w:rFonts w:ascii="Arial" w:hAnsi="Arial"/>
           <w:b/>
           <w:color w:val="1E293B"/>
           <w:sz w:val="22"/>
@@ -481,23 +824,23 @@
         <w:tblLook w:firstColumn="1" w:firstRow="1" w:lastColumn="0" w:lastRow="0" w:noHBand="0" w:noVBand="1" w:val="04A0"/>
       </w:tblPr>
       <w:tblGrid>
-        <w:gridCol w:w="1560"/>
-        <w:gridCol w:w="1560"/>
-        <w:gridCol w:w="1560"/>
-        <w:gridCol w:w="1560"/>
-        <w:gridCol w:w="1560"/>
-        <w:gridCol w:w="1560"/>
+        <w:gridCol w:w="1656"/>
+        <w:gridCol w:w="1656"/>
+        <w:gridCol w:w="1656"/>
+        <w:gridCol w:w="1656"/>
+        <w:gridCol w:w="1656"/>
+        <w:gridCol w:w="1656"/>
       </w:tblGrid>
       <w:tr>
         <w:tc>
           <w:tcPr>
-            <w:tcW w:type="dxa" w:w="1560"/>
+            <w:tcW w:type="dxa" w:w="1656"/>
             <w:shd w:fill="0F172A"/>
             <w:tcMar>
-              <w:top w:w="120" w:type="dxa"/>
-              <w:bottom w:w="120" w:type="dxa"/>
-              <w:left w:w="100" w:type="dxa"/>
-              <w:right w:w="100" w:type="dxa"/>
+              <w:top w:w="100" w:type="dxa"/>
+              <w:bottom w:w="100" w:type="dxa"/>
+              <w:left w:w="80" w:type="dxa"/>
+              <w:right w:w="80" w:type="dxa"/>
             </w:tcMar>
           </w:tcPr>
           <w:p>
@@ -506,9 +849,10 @@
             </w:pPr>
             <w:r>
               <w:rPr>
+                <w:rFonts w:ascii="Arial" w:hAnsi="Arial"/>
                 <w:b/>
                 <w:color w:val="FFFFFF"/>
-                <w:sz w:val="17"/>
+                <w:sz w:val="16"/>
               </w:rPr>
               <w:t>Fase / Semana</w:t>
             </w:r>
@@ -516,13 +860,13 @@
         </w:tc>
         <w:tc>
           <w:tcPr>
-            <w:tcW w:type="dxa" w:w="1560"/>
+            <w:tcW w:type="dxa" w:w="1656"/>
             <w:shd w:fill="0F172A"/>
             <w:tcMar>
-              <w:top w:w="120" w:type="dxa"/>
-              <w:bottom w:w="120" w:type="dxa"/>
-              <w:left w:w="100" w:type="dxa"/>
-              <w:right w:w="100" w:type="dxa"/>
+              <w:top w:w="100" w:type="dxa"/>
+              <w:bottom w:w="100" w:type="dxa"/>
+              <w:left w:w="80" w:type="dxa"/>
+              <w:right w:w="80" w:type="dxa"/>
             </w:tcMar>
           </w:tcPr>
           <w:p>
@@ -531,9 +875,10 @@
             </w:pPr>
             <w:r>
               <w:rPr>
+                <w:rFonts w:ascii="Arial" w:hAnsi="Arial"/>
                 <w:b/>
                 <w:color w:val="FFFFFF"/>
-                <w:sz w:val="17"/>
+                <w:sz w:val="16"/>
               </w:rPr>
               <w:t>Saber (Conceptual)</w:t>
             </w:r>
@@ -541,13 +886,13 @@
         </w:tc>
         <w:tc>
           <w:tcPr>
-            <w:tcW w:type="dxa" w:w="1560"/>
+            <w:tcW w:type="dxa" w:w="1656"/>
             <w:shd w:fill="0F172A"/>
             <w:tcMar>
-              <w:top w:w="120" w:type="dxa"/>
-              <w:bottom w:w="120" w:type="dxa"/>
-              <w:left w:w="100" w:type="dxa"/>
-              <w:right w:w="100" w:type="dxa"/>
+              <w:top w:w="100" w:type="dxa"/>
+              <w:bottom w:w="100" w:type="dxa"/>
+              <w:left w:w="80" w:type="dxa"/>
+              <w:right w:w="80" w:type="dxa"/>
             </w:tcMar>
           </w:tcPr>
           <w:p>
@@ -556,9 +901,10 @@
             </w:pPr>
             <w:r>
               <w:rPr>
+                <w:rFonts w:ascii="Arial" w:hAnsi="Arial"/>
                 <w:b/>
                 <w:color w:val="FFFFFF"/>
-                <w:sz w:val="17"/>
+                <w:sz w:val="16"/>
               </w:rPr>
               <w:t>Hacer (Procedimental)</w:t>
             </w:r>
@@ -566,13 +912,13 @@
         </w:tc>
         <w:tc>
           <w:tcPr>
-            <w:tcW w:type="dxa" w:w="1560"/>
+            <w:tcW w:type="dxa" w:w="1656"/>
             <w:shd w:fill="0F172A"/>
             <w:tcMar>
-              <w:top w:w="120" w:type="dxa"/>
-              <w:bottom w:w="120" w:type="dxa"/>
-              <w:left w:w="100" w:type="dxa"/>
-              <w:right w:w="100" w:type="dxa"/>
+              <w:top w:w="100" w:type="dxa"/>
+              <w:bottom w:w="100" w:type="dxa"/>
+              <w:left w:w="80" w:type="dxa"/>
+              <w:right w:w="80" w:type="dxa"/>
             </w:tcMar>
           </w:tcPr>
           <w:p>
@@ -581,9 +927,10 @@
             </w:pPr>
             <w:r>
               <w:rPr>
+                <w:rFonts w:ascii="Arial" w:hAnsi="Arial"/>
                 <w:b/>
                 <w:color w:val="FFFFFF"/>
-                <w:sz w:val="17"/>
+                <w:sz w:val="16"/>
               </w:rPr>
               <w:t>Ser y Convivir (Actitudinal)</w:t>
             </w:r>
@@ -591,13 +938,13 @@
         </w:tc>
         <w:tc>
           <w:tcPr>
-            <w:tcW w:type="dxa" w:w="1560"/>
+            <w:tcW w:type="dxa" w:w="1656"/>
             <w:shd w:fill="0F172A"/>
             <w:tcMar>
-              <w:top w:w="120" w:type="dxa"/>
-              <w:bottom w:w="120" w:type="dxa"/>
-              <w:left w:w="100" w:type="dxa"/>
-              <w:right w:w="100" w:type="dxa"/>
+              <w:top w:w="100" w:type="dxa"/>
+              <w:bottom w:w="100" w:type="dxa"/>
+              <w:left w:w="80" w:type="dxa"/>
+              <w:right w:w="80" w:type="dxa"/>
             </w:tcMar>
           </w:tcPr>
           <w:p>
@@ -606,9 +953,10 @@
             </w:pPr>
             <w:r>
               <w:rPr>
+                <w:rFonts w:ascii="Arial" w:hAnsi="Arial"/>
                 <w:b/>
                 <w:color w:val="FFFFFF"/>
-                <w:sz w:val="17"/>
+                <w:sz w:val="16"/>
               </w:rPr>
               <w:t>Sudor Intelectual (Evidencia)</w:t>
             </w:r>
@@ -616,13 +964,13 @@
         </w:tc>
         <w:tc>
           <w:tcPr>
-            <w:tcW w:type="dxa" w:w="1560"/>
+            <w:tcW w:type="dxa" w:w="1656"/>
             <w:shd w:fill="0F172A"/>
             <w:tcMar>
-              <w:top w:w="120" w:type="dxa"/>
-              <w:bottom w:w="120" w:type="dxa"/>
-              <w:left w:w="100" w:type="dxa"/>
-              <w:right w:w="100" w:type="dxa"/>
+              <w:top w:w="100" w:type="dxa"/>
+              <w:bottom w:w="100" w:type="dxa"/>
+              <w:left w:w="80" w:type="dxa"/>
+              <w:right w:w="80" w:type="dxa"/>
             </w:tcMar>
           </w:tcPr>
           <w:p>
@@ -631,9 +979,10 @@
             </w:pPr>
             <w:r>
               <w:rPr>
+                <w:rFonts w:ascii="Arial" w:hAnsi="Arial"/>
                 <w:b/>
                 <w:color w:val="FFFFFF"/>
-                <w:sz w:val="17"/>
+                <w:sz w:val="16"/>
               </w:rPr>
               <w:t>Criterio de Evaluación</w:t>
             </w:r>
@@ -643,13 +992,13 @@
       <w:tr>
         <w:tc>
           <w:tcPr>
-            <w:tcW w:type="dxa" w:w="1560"/>
+            <w:tcW w:type="dxa" w:w="1656"/>
             <w:shd w:fill="FFFFFF"/>
             <w:tcMar>
-              <w:top w:w="100" w:type="dxa"/>
-              <w:bottom w:w="100" w:type="dxa"/>
-              <w:left w:w="100" w:type="dxa"/>
-              <w:right w:w="100" w:type="dxa"/>
+              <w:top w:w="90" w:type="dxa"/>
+              <w:bottom w:w="90" w:type="dxa"/>
+              <w:left w:w="80" w:type="dxa"/>
+              <w:right w:w="80" w:type="dxa"/>
             </w:tcMar>
           </w:tcPr>
           <w:p>
@@ -658,9 +1007,10 @@
             </w:pPr>
             <w:r>
               <w:rPr>
+                <w:rFonts w:ascii="Arial" w:hAnsi="Arial"/>
                 <w:b/>
                 <w:color w:val="0F172A"/>
-                <w:sz w:val="17"/>
+                <w:sz w:val="16"/>
               </w:rPr>
               <w:t>Semana 1:</w:t>
               <w:br/>
@@ -670,13 +1020,13 @@
         </w:tc>
         <w:tc>
           <w:tcPr>
-            <w:tcW w:type="dxa" w:w="1560"/>
+            <w:tcW w:type="dxa" w:w="1656"/>
             <w:shd w:fill="FFFFFF"/>
             <w:tcMar>
-              <w:top w:w="100" w:type="dxa"/>
-              <w:bottom w:w="100" w:type="dxa"/>
-              <w:left w:w="100" w:type="dxa"/>
-              <w:right w:w="100" w:type="dxa"/>
+              <w:top w:w="90" w:type="dxa"/>
+              <w:bottom w:w="90" w:type="dxa"/>
+              <w:left w:w="80" w:type="dxa"/>
+              <w:right w:w="80" w:type="dxa"/>
             </w:tcMar>
           </w:tcPr>
           <w:p>
@@ -685,8 +1035,9 @@
             </w:pPr>
             <w:r>
               <w:rPr>
+                <w:rFonts w:ascii="Arial" w:hAnsi="Arial"/>
                 <w:color w:val="0F172A"/>
-                <w:sz w:val="17"/>
+                <w:sz w:val="16"/>
               </w:rPr>
               <w:t>[[FASE_1_SABER]]</w:t>
             </w:r>
@@ -694,13 +1045,13 @@
         </w:tc>
         <w:tc>
           <w:tcPr>
-            <w:tcW w:type="dxa" w:w="1560"/>
+            <w:tcW w:type="dxa" w:w="1656"/>
             <w:shd w:fill="FFFFFF"/>
             <w:tcMar>
-              <w:top w:w="100" w:type="dxa"/>
-              <w:bottom w:w="100" w:type="dxa"/>
-              <w:left w:w="100" w:type="dxa"/>
-              <w:right w:w="100" w:type="dxa"/>
+              <w:top w:w="90" w:type="dxa"/>
+              <w:bottom w:w="90" w:type="dxa"/>
+              <w:left w:w="80" w:type="dxa"/>
+              <w:right w:w="80" w:type="dxa"/>
             </w:tcMar>
           </w:tcPr>
           <w:p>
@@ -709,8 +1060,9 @@
             </w:pPr>
             <w:r>
               <w:rPr>
+                <w:rFonts w:ascii="Arial" w:hAnsi="Arial"/>
                 <w:color w:val="0F172A"/>
-                <w:sz w:val="17"/>
+                <w:sz w:val="16"/>
               </w:rPr>
               <w:t>[[FASE_1_HACER]]</w:t>
             </w:r>
@@ -718,13 +1070,13 @@
         </w:tc>
         <w:tc>
           <w:tcPr>
-            <w:tcW w:type="dxa" w:w="1560"/>
+            <w:tcW w:type="dxa" w:w="1656"/>
             <w:shd w:fill="FFFFFF"/>
             <w:tcMar>
-              <w:top w:w="100" w:type="dxa"/>
-              <w:bottom w:w="100" w:type="dxa"/>
-              <w:left w:w="100" w:type="dxa"/>
-              <w:right w:w="100" w:type="dxa"/>
+              <w:top w:w="90" w:type="dxa"/>
+              <w:bottom w:w="90" w:type="dxa"/>
+              <w:left w:w="80" w:type="dxa"/>
+              <w:right w:w="80" w:type="dxa"/>
             </w:tcMar>
           </w:tcPr>
           <w:p>
@@ -733,8 +1085,9 @@
             </w:pPr>
             <w:r>
               <w:rPr>
+                <w:rFonts w:ascii="Arial" w:hAnsi="Arial"/>
                 <w:color w:val="0F172A"/>
-                <w:sz w:val="17"/>
+                <w:sz w:val="16"/>
               </w:rPr>
               <w:t>[[FASE_1_SER]]</w:t>
             </w:r>
@@ -742,13 +1095,13 @@
         </w:tc>
         <w:tc>
           <w:tcPr>
-            <w:tcW w:type="dxa" w:w="1560"/>
+            <w:tcW w:type="dxa" w:w="1656"/>
             <w:shd w:fill="FFFFFF"/>
             <w:tcMar>
-              <w:top w:w="100" w:type="dxa"/>
-              <w:bottom w:w="100" w:type="dxa"/>
-              <w:left w:w="100" w:type="dxa"/>
-              <w:right w:w="100" w:type="dxa"/>
+              <w:top w:w="90" w:type="dxa"/>
+              <w:bottom w:w="90" w:type="dxa"/>
+              <w:left w:w="80" w:type="dxa"/>
+              <w:right w:w="80" w:type="dxa"/>
             </w:tcMar>
           </w:tcPr>
           <w:p>
@@ -757,8 +1110,9 @@
             </w:pPr>
             <w:r>
               <w:rPr>
+                <w:rFonts w:ascii="Arial" w:hAnsi="Arial"/>
                 <w:color w:val="0F172A"/>
-                <w:sz w:val="17"/>
+                <w:sz w:val="16"/>
               </w:rPr>
               <w:t>[[FASE_1_SUDOR_INTELECTUAL]]</w:t>
             </w:r>
@@ -766,13 +1120,13 @@
         </w:tc>
         <w:tc>
           <w:tcPr>
-            <w:tcW w:type="dxa" w:w="1560"/>
+            <w:tcW w:type="dxa" w:w="1656"/>
             <w:shd w:fill="FFFFFF"/>
             <w:tcMar>
-              <w:top w:w="100" w:type="dxa"/>
-              <w:bottom w:w="100" w:type="dxa"/>
-              <w:left w:w="100" w:type="dxa"/>
-              <w:right w:w="100" w:type="dxa"/>
+              <w:top w:w="90" w:type="dxa"/>
+              <w:bottom w:w="90" w:type="dxa"/>
+              <w:left w:w="80" w:type="dxa"/>
+              <w:right w:w="80" w:type="dxa"/>
             </w:tcMar>
           </w:tcPr>
           <w:p>
@@ -781,8 +1135,9 @@
             </w:pPr>
             <w:r>
               <w:rPr>
+                <w:rFonts w:ascii="Arial" w:hAnsi="Arial"/>
                 <w:color w:val="0F172A"/>
-                <w:sz w:val="17"/>
+                <w:sz w:val="16"/>
               </w:rPr>
               <w:t>[[FASE_1_CRITERIO_EVAL]]</w:t>
             </w:r>
@@ -792,13 +1147,13 @@
       <w:tr>
         <w:tc>
           <w:tcPr>
-            <w:tcW w:type="dxa" w:w="1560"/>
+            <w:tcW w:type="dxa" w:w="1656"/>
             <w:shd w:fill="F8FAFC"/>
             <w:tcMar>
-              <w:top w:w="100" w:type="dxa"/>
-              <w:bottom w:w="100" w:type="dxa"/>
-              <w:left w:w="100" w:type="dxa"/>
-              <w:right w:w="100" w:type="dxa"/>
+              <w:top w:w="90" w:type="dxa"/>
+              <w:bottom w:w="90" w:type="dxa"/>
+              <w:left w:w="80" w:type="dxa"/>
+              <w:right w:w="80" w:type="dxa"/>
             </w:tcMar>
           </w:tcPr>
           <w:p>
@@ -807,9 +1162,10 @@
             </w:pPr>
             <w:r>
               <w:rPr>
+                <w:rFonts w:ascii="Arial" w:hAnsi="Arial"/>
                 <w:b/>
                 <w:color w:val="0F172A"/>
-                <w:sz w:val="17"/>
+                <w:sz w:val="16"/>
               </w:rPr>
               <w:t>Semana 2:</w:t>
               <w:br/>
@@ -819,13 +1175,13 @@
         </w:tc>
         <w:tc>
           <w:tcPr>
-            <w:tcW w:type="dxa" w:w="1560"/>
+            <w:tcW w:type="dxa" w:w="1656"/>
             <w:shd w:fill="F8FAFC"/>
             <w:tcMar>
-              <w:top w:w="100" w:type="dxa"/>
-              <w:bottom w:w="100" w:type="dxa"/>
-              <w:left w:w="100" w:type="dxa"/>
-              <w:right w:w="100" w:type="dxa"/>
+              <w:top w:w="90" w:type="dxa"/>
+              <w:bottom w:w="90" w:type="dxa"/>
+              <w:left w:w="80" w:type="dxa"/>
+              <w:right w:w="80" w:type="dxa"/>
             </w:tcMar>
           </w:tcPr>
           <w:p>
@@ -834,8 +1190,9 @@
             </w:pPr>
             <w:r>
               <w:rPr>
+                <w:rFonts w:ascii="Arial" w:hAnsi="Arial"/>
                 <w:color w:val="0F172A"/>
-                <w:sz w:val="17"/>
+                <w:sz w:val="16"/>
               </w:rPr>
               <w:t>[[FASE_2_SABER]]</w:t>
             </w:r>
@@ -843,13 +1200,13 @@
         </w:tc>
         <w:tc>
           <w:tcPr>
-            <w:tcW w:type="dxa" w:w="1560"/>
+            <w:tcW w:type="dxa" w:w="1656"/>
             <w:shd w:fill="F8FAFC"/>
             <w:tcMar>
-              <w:top w:w="100" w:type="dxa"/>
-              <w:bottom w:w="100" w:type="dxa"/>
-              <w:left w:w="100" w:type="dxa"/>
-              <w:right w:w="100" w:type="dxa"/>
+              <w:top w:w="90" w:type="dxa"/>
+              <w:bottom w:w="90" w:type="dxa"/>
+              <w:left w:w="80" w:type="dxa"/>
+              <w:right w:w="80" w:type="dxa"/>
             </w:tcMar>
           </w:tcPr>
           <w:p>
@@ -858,8 +1215,9 @@
             </w:pPr>
             <w:r>
               <w:rPr>
+                <w:rFonts w:ascii="Arial" w:hAnsi="Arial"/>
                 <w:color w:val="0F172A"/>
-                <w:sz w:val="17"/>
+                <w:sz w:val="16"/>
               </w:rPr>
               <w:t>[[FASE_2_HACER]]</w:t>
             </w:r>
@@ -867,13 +1225,13 @@
         </w:tc>
         <w:tc>
           <w:tcPr>
-            <w:tcW w:type="dxa" w:w="1560"/>
+            <w:tcW w:type="dxa" w:w="1656"/>
             <w:shd w:fill="F8FAFC"/>
             <w:tcMar>
-              <w:top w:w="100" w:type="dxa"/>
-              <w:bottom w:w="100" w:type="dxa"/>
-              <w:left w:w="100" w:type="dxa"/>
-              <w:right w:w="100" w:type="dxa"/>
+              <w:top w:w="90" w:type="dxa"/>
+              <w:bottom w:w="90" w:type="dxa"/>
+              <w:left w:w="80" w:type="dxa"/>
+              <w:right w:w="80" w:type="dxa"/>
             </w:tcMar>
           </w:tcPr>
           <w:p>
@@ -882,8 +1240,9 @@
             </w:pPr>
             <w:r>
               <w:rPr>
+                <w:rFonts w:ascii="Arial" w:hAnsi="Arial"/>
                 <w:color w:val="0F172A"/>
-                <w:sz w:val="17"/>
+                <w:sz w:val="16"/>
               </w:rPr>
               <w:t>[[FASE_2_SER]]</w:t>
             </w:r>
@@ -891,13 +1250,13 @@
         </w:tc>
         <w:tc>
           <w:tcPr>
-            <w:tcW w:type="dxa" w:w="1560"/>
+            <w:tcW w:type="dxa" w:w="1656"/>
             <w:shd w:fill="F8FAFC"/>
             <w:tcMar>
-              <w:top w:w="100" w:type="dxa"/>
-              <w:bottom w:w="100" w:type="dxa"/>
-              <w:left w:w="100" w:type="dxa"/>
-              <w:right w:w="100" w:type="dxa"/>
+              <w:top w:w="90" w:type="dxa"/>
+              <w:bottom w:w="90" w:type="dxa"/>
+              <w:left w:w="80" w:type="dxa"/>
+              <w:right w:w="80" w:type="dxa"/>
             </w:tcMar>
           </w:tcPr>
           <w:p>
@@ -906,8 +1265,9 @@
             </w:pPr>
             <w:r>
               <w:rPr>
+                <w:rFonts w:ascii="Arial" w:hAnsi="Arial"/>
                 <w:color w:val="0F172A"/>
-                <w:sz w:val="17"/>
+                <w:sz w:val="16"/>
               </w:rPr>
               <w:t>[[FASE_2_SUDOR_INTELECTUAL]]</w:t>
             </w:r>
@@ -915,13 +1275,13 @@
         </w:tc>
         <w:tc>
           <w:tcPr>
-            <w:tcW w:type="dxa" w:w="1560"/>
+            <w:tcW w:type="dxa" w:w="1656"/>
             <w:shd w:fill="F8FAFC"/>
             <w:tcMar>
-              <w:top w:w="100" w:type="dxa"/>
-              <w:bottom w:w="100" w:type="dxa"/>
-              <w:left w:w="100" w:type="dxa"/>
-              <w:right w:w="100" w:type="dxa"/>
+              <w:top w:w="90" w:type="dxa"/>
+              <w:bottom w:w="90" w:type="dxa"/>
+              <w:left w:w="80" w:type="dxa"/>
+              <w:right w:w="80" w:type="dxa"/>
             </w:tcMar>
           </w:tcPr>
           <w:p>
@@ -930,8 +1290,9 @@
             </w:pPr>
             <w:r>
               <w:rPr>
+                <w:rFonts w:ascii="Arial" w:hAnsi="Arial"/>
                 <w:color w:val="0F172A"/>
-                <w:sz w:val="17"/>
+                <w:sz w:val="16"/>
               </w:rPr>
               <w:t>[[FASE_2_CRITERIO_EVAL]]</w:t>
             </w:r>
@@ -941,13 +1302,13 @@
       <w:tr>
         <w:tc>
           <w:tcPr>
-            <w:tcW w:type="dxa" w:w="1560"/>
+            <w:tcW w:type="dxa" w:w="1656"/>
             <w:shd w:fill="FFFFFF"/>
             <w:tcMar>
-              <w:top w:w="100" w:type="dxa"/>
-              <w:bottom w:w="100" w:type="dxa"/>
-              <w:left w:w="100" w:type="dxa"/>
-              <w:right w:w="100" w:type="dxa"/>
+              <w:top w:w="90" w:type="dxa"/>
+              <w:bottom w:w="90" w:type="dxa"/>
+              <w:left w:w="80" w:type="dxa"/>
+              <w:right w:w="80" w:type="dxa"/>
             </w:tcMar>
           </w:tcPr>
           <w:p>
@@ -956,9 +1317,10 @@
             </w:pPr>
             <w:r>
               <w:rPr>
+                <w:rFonts w:ascii="Arial" w:hAnsi="Arial"/>
                 <w:b/>
                 <w:color w:val="0F172A"/>
-                <w:sz w:val="17"/>
+                <w:sz w:val="16"/>
               </w:rPr>
               <w:t>Semana 3:</w:t>
               <w:br/>
@@ -968,13 +1330,13 @@
         </w:tc>
         <w:tc>
           <w:tcPr>
-            <w:tcW w:type="dxa" w:w="1560"/>
+            <w:tcW w:type="dxa" w:w="1656"/>
             <w:shd w:fill="FFFFFF"/>
             <w:tcMar>
-              <w:top w:w="100" w:type="dxa"/>
-              <w:bottom w:w="100" w:type="dxa"/>
-              <w:left w:w="100" w:type="dxa"/>
-              <w:right w:w="100" w:type="dxa"/>
+              <w:top w:w="90" w:type="dxa"/>
+              <w:bottom w:w="90" w:type="dxa"/>
+              <w:left w:w="80" w:type="dxa"/>
+              <w:right w:w="80" w:type="dxa"/>
             </w:tcMar>
           </w:tcPr>
           <w:p>
@@ -983,8 +1345,9 @@
             </w:pPr>
             <w:r>
               <w:rPr>
+                <w:rFonts w:ascii="Arial" w:hAnsi="Arial"/>
                 <w:color w:val="0F172A"/>
-                <w:sz w:val="17"/>
+                <w:sz w:val="16"/>
               </w:rPr>
               <w:t>[[FASE_3_SABER]]</w:t>
             </w:r>
@@ -992,13 +1355,13 @@
         </w:tc>
         <w:tc>
           <w:tcPr>
-            <w:tcW w:type="dxa" w:w="1560"/>
+            <w:tcW w:type="dxa" w:w="1656"/>
             <w:shd w:fill="FFFFFF"/>
             <w:tcMar>
-              <w:top w:w="100" w:type="dxa"/>
-              <w:bottom w:w="100" w:type="dxa"/>
-              <w:left w:w="100" w:type="dxa"/>
-              <w:right w:w="100" w:type="dxa"/>
+              <w:top w:w="90" w:type="dxa"/>
+              <w:bottom w:w="90" w:type="dxa"/>
+              <w:left w:w="80" w:type="dxa"/>
+              <w:right w:w="80" w:type="dxa"/>
             </w:tcMar>
           </w:tcPr>
           <w:p>
@@ -1007,8 +1370,9 @@
             </w:pPr>
             <w:r>
               <w:rPr>
+                <w:rFonts w:ascii="Arial" w:hAnsi="Arial"/>
                 <w:color w:val="0F172A"/>
-                <w:sz w:val="17"/>
+                <w:sz w:val="16"/>
               </w:rPr>
               <w:t>[[FASE_3_HACER]]</w:t>
             </w:r>
@@ -1016,13 +1380,13 @@
         </w:tc>
         <w:tc>
           <w:tcPr>
-            <w:tcW w:type="dxa" w:w="1560"/>
+            <w:tcW w:type="dxa" w:w="1656"/>
             <w:shd w:fill="FFFFFF"/>
             <w:tcMar>
-              <w:top w:w="100" w:type="dxa"/>
-              <w:bottom w:w="100" w:type="dxa"/>
-              <w:left w:w="100" w:type="dxa"/>
-              <w:right w:w="100" w:type="dxa"/>
+              <w:top w:w="90" w:type="dxa"/>
+              <w:bottom w:w="90" w:type="dxa"/>
+              <w:left w:w="80" w:type="dxa"/>
+              <w:right w:w="80" w:type="dxa"/>
             </w:tcMar>
           </w:tcPr>
           <w:p>
@@ -1031,8 +1395,9 @@
             </w:pPr>
             <w:r>
               <w:rPr>
+                <w:rFonts w:ascii="Arial" w:hAnsi="Arial"/>
                 <w:color w:val="0F172A"/>
-                <w:sz w:val="17"/>
+                <w:sz w:val="16"/>
               </w:rPr>
               <w:t>[[FASE_3_SER]]</w:t>
             </w:r>
@@ -1040,13 +1405,13 @@
         </w:tc>
         <w:tc>
           <w:tcPr>
-            <w:tcW w:type="dxa" w:w="1560"/>
+            <w:tcW w:type="dxa" w:w="1656"/>
             <w:shd w:fill="FFFFFF"/>
             <w:tcMar>
-              <w:top w:w="100" w:type="dxa"/>
-              <w:bottom w:w="100" w:type="dxa"/>
-              <w:left w:w="100" w:type="dxa"/>
-              <w:right w:w="100" w:type="dxa"/>
+              <w:top w:w="90" w:type="dxa"/>
+              <w:bottom w:w="90" w:type="dxa"/>
+              <w:left w:w="80" w:type="dxa"/>
+              <w:right w:w="80" w:type="dxa"/>
             </w:tcMar>
           </w:tcPr>
           <w:p>
@@ -1055,8 +1420,9 @@
             </w:pPr>
             <w:r>
               <w:rPr>
+                <w:rFonts w:ascii="Arial" w:hAnsi="Arial"/>
                 <w:color w:val="0F172A"/>
-                <w:sz w:val="17"/>
+                <w:sz w:val="16"/>
               </w:rPr>
               <w:t>[[FASE_3_SUDOR_INTELECTUAL]]</w:t>
             </w:r>
@@ -1064,13 +1430,13 @@
         </w:tc>
         <w:tc>
           <w:tcPr>
-            <w:tcW w:type="dxa" w:w="1560"/>
+            <w:tcW w:type="dxa" w:w="1656"/>
             <w:shd w:fill="FFFFFF"/>
             <w:tcMar>
-              <w:top w:w="100" w:type="dxa"/>
-              <w:bottom w:w="100" w:type="dxa"/>
-              <w:left w:w="100" w:type="dxa"/>
-              <w:right w:w="100" w:type="dxa"/>
+              <w:top w:w="90" w:type="dxa"/>
+              <w:bottom w:w="90" w:type="dxa"/>
+              <w:left w:w="80" w:type="dxa"/>
+              <w:right w:w="80" w:type="dxa"/>
             </w:tcMar>
           </w:tcPr>
           <w:p>
@@ -1079,8 +1445,9 @@
             </w:pPr>
             <w:r>
               <w:rPr>
+                <w:rFonts w:ascii="Arial" w:hAnsi="Arial"/>
                 <w:color w:val="0F172A"/>
-                <w:sz w:val="17"/>
+                <w:sz w:val="16"/>
               </w:rPr>
               <w:t>[[FASE_3_CRITERIO_EVAL]]</w:t>
             </w:r>
@@ -1090,13 +1457,13 @@
       <w:tr>
         <w:tc>
           <w:tcPr>
-            <w:tcW w:type="dxa" w:w="1560"/>
+            <w:tcW w:type="dxa" w:w="1656"/>
             <w:shd w:fill="F8FAFC"/>
             <w:tcMar>
-              <w:top w:w="100" w:type="dxa"/>
-              <w:bottom w:w="100" w:type="dxa"/>
-              <w:left w:w="100" w:type="dxa"/>
-              <w:right w:w="100" w:type="dxa"/>
+              <w:top w:w="90" w:type="dxa"/>
+              <w:bottom w:w="90" w:type="dxa"/>
+              <w:left w:w="80" w:type="dxa"/>
+              <w:right w:w="80" w:type="dxa"/>
             </w:tcMar>
           </w:tcPr>
           <w:p>
@@ -1105,9 +1472,10 @@
             </w:pPr>
             <w:r>
               <w:rPr>
+                <w:rFonts w:ascii="Arial" w:hAnsi="Arial"/>
                 <w:b/>
                 <w:color w:val="0F172A"/>
-                <w:sz w:val="17"/>
+                <w:sz w:val="16"/>
               </w:rPr>
               <w:t>Semana 4:</w:t>
               <w:br/>
@@ -1117,13 +1485,13 @@
         </w:tc>
         <w:tc>
           <w:tcPr>
-            <w:tcW w:type="dxa" w:w="1560"/>
+            <w:tcW w:type="dxa" w:w="1656"/>
             <w:shd w:fill="F8FAFC"/>
             <w:tcMar>
-              <w:top w:w="100" w:type="dxa"/>
-              <w:bottom w:w="100" w:type="dxa"/>
-              <w:left w:w="100" w:type="dxa"/>
-              <w:right w:w="100" w:type="dxa"/>
+              <w:top w:w="90" w:type="dxa"/>
+              <w:bottom w:w="90" w:type="dxa"/>
+              <w:left w:w="80" w:type="dxa"/>
+              <w:right w:w="80" w:type="dxa"/>
             </w:tcMar>
           </w:tcPr>
           <w:p>
@@ -1132,8 +1500,9 @@
             </w:pPr>
             <w:r>
               <w:rPr>
+                <w:rFonts w:ascii="Arial" w:hAnsi="Arial"/>
                 <w:color w:val="0F172A"/>
-                <w:sz w:val="17"/>
+                <w:sz w:val="16"/>
               </w:rPr>
               <w:t>[[FASE_4_SABER]]</w:t>
             </w:r>
@@ -1141,13 +1510,13 @@
         </w:tc>
         <w:tc>
           <w:tcPr>
-            <w:tcW w:type="dxa" w:w="1560"/>
+            <w:tcW w:type="dxa" w:w="1656"/>
             <w:shd w:fill="F8FAFC"/>
             <w:tcMar>
-              <w:top w:w="100" w:type="dxa"/>
-              <w:bottom w:w="100" w:type="dxa"/>
-              <w:left w:w="100" w:type="dxa"/>
-              <w:right w:w="100" w:type="dxa"/>
+              <w:top w:w="90" w:type="dxa"/>
+              <w:bottom w:w="90" w:type="dxa"/>
+              <w:left w:w="80" w:type="dxa"/>
+              <w:right w:w="80" w:type="dxa"/>
             </w:tcMar>
           </w:tcPr>
           <w:p>
@@ -1156,8 +1525,9 @@
             </w:pPr>
             <w:r>
               <w:rPr>
+                <w:rFonts w:ascii="Arial" w:hAnsi="Arial"/>
                 <w:color w:val="0F172A"/>
-                <w:sz w:val="17"/>
+                <w:sz w:val="16"/>
               </w:rPr>
               <w:t>[[FASE_4_HACER]]</w:t>
             </w:r>
@@ -1165,13 +1535,13 @@
         </w:tc>
         <w:tc>
           <w:tcPr>
-            <w:tcW w:type="dxa" w:w="1560"/>
+            <w:tcW w:type="dxa" w:w="1656"/>
             <w:shd w:fill="F8FAFC"/>
             <w:tcMar>
-              <w:top w:w="100" w:type="dxa"/>
-              <w:bottom w:w="100" w:type="dxa"/>
-              <w:left w:w="100" w:type="dxa"/>
-              <w:right w:w="100" w:type="dxa"/>
+              <w:top w:w="90" w:type="dxa"/>
+              <w:bottom w:w="90" w:type="dxa"/>
+              <w:left w:w="80" w:type="dxa"/>
+              <w:right w:w="80" w:type="dxa"/>
             </w:tcMar>
           </w:tcPr>
           <w:p>
@@ -1180,8 +1550,9 @@
             </w:pPr>
             <w:r>
               <w:rPr>
+                <w:rFonts w:ascii="Arial" w:hAnsi="Arial"/>
                 <w:color w:val="0F172A"/>
-                <w:sz w:val="17"/>
+                <w:sz w:val="16"/>
               </w:rPr>
               <w:t>[[FASE_4_SER]]</w:t>
             </w:r>
@@ -1189,13 +1560,13 @@
         </w:tc>
         <w:tc>
           <w:tcPr>
-            <w:tcW w:type="dxa" w:w="1560"/>
+            <w:tcW w:type="dxa" w:w="1656"/>
             <w:shd w:fill="F8FAFC"/>
             <w:tcMar>
-              <w:top w:w="100" w:type="dxa"/>
-              <w:bottom w:w="100" w:type="dxa"/>
-              <w:left w:w="100" w:type="dxa"/>
-              <w:right w:w="100" w:type="dxa"/>
+              <w:top w:w="90" w:type="dxa"/>
+              <w:bottom w:w="90" w:type="dxa"/>
+              <w:left w:w="80" w:type="dxa"/>
+              <w:right w:w="80" w:type="dxa"/>
             </w:tcMar>
           </w:tcPr>
           <w:p>
@@ -1204,8 +1575,9 @@
             </w:pPr>
             <w:r>
               <w:rPr>
+                <w:rFonts w:ascii="Arial" w:hAnsi="Arial"/>
                 <w:color w:val="0F172A"/>
-                <w:sz w:val="17"/>
+                <w:sz w:val="16"/>
               </w:rPr>
               <w:t>[[FASE_4_SUDOR_INTELECTUAL]]</w:t>
             </w:r>
@@ -1213,13 +1585,13 @@
         </w:tc>
         <w:tc>
           <w:tcPr>
-            <w:tcW w:type="dxa" w:w="1560"/>
+            <w:tcW w:type="dxa" w:w="1656"/>
             <w:shd w:fill="F8FAFC"/>
             <w:tcMar>
-              <w:top w:w="100" w:type="dxa"/>
-              <w:bottom w:w="100" w:type="dxa"/>
-              <w:left w:w="100" w:type="dxa"/>
-              <w:right w:w="100" w:type="dxa"/>
+              <w:top w:w="90" w:type="dxa"/>
+              <w:bottom w:w="90" w:type="dxa"/>
+              <w:left w:w="80" w:type="dxa"/>
+              <w:right w:w="80" w:type="dxa"/>
             </w:tcMar>
           </w:tcPr>
           <w:p>
@@ -1228,8 +1600,9 @@
             </w:pPr>
             <w:r>
               <w:rPr>
+                <w:rFonts w:ascii="Arial" w:hAnsi="Arial"/>
                 <w:color w:val="0F172A"/>
-                <w:sz w:val="17"/>
+                <w:sz w:val="16"/>
               </w:rPr>
               <w:t>[[FASE_4_CRITERIO_EVAL]]</w:t>
             </w:r>
@@ -1241,6 +1614,7 @@
     <w:p>
       <w:r>
         <w:rPr>
+          <w:rFonts w:ascii="Arial" w:hAnsi="Arial"/>
           <w:b/>
           <w:color w:val="1E293B"/>
           <w:sz w:val="22"/>
@@ -1256,48 +1630,50 @@
         <w:tblLook w:firstColumn="1" w:firstRow="1" w:lastColumn="0" w:lastRow="0" w:noHBand="0" w:noVBand="1" w:val="04A0"/>
       </w:tblPr>
       <w:tblGrid>
-        <w:gridCol w:w="4680"/>
-        <w:gridCol w:w="4680"/>
+        <w:gridCol w:w="4968"/>
+        <w:gridCol w:w="4968"/>
       </w:tblGrid>
       <w:tr>
         <w:tc>
           <w:tcPr>
-            <w:tcW w:type="dxa" w:w="4680"/>
+            <w:tcW w:type="dxa" w:w="4968"/>
             <w:tcMar>
-              <w:top w:w="120" w:type="dxa"/>
-              <w:bottom w:w="120" w:type="dxa"/>
-              <w:left w:w="150" w:type="dxa"/>
-              <w:right w:w="150" w:type="dxa"/>
+              <w:top w:w="100" w:type="dxa"/>
+              <w:bottom w:w="100" w:type="dxa"/>
+              <w:left w:w="120" w:type="dxa"/>
+              <w:right w:w="120" w:type="dxa"/>
             </w:tcMar>
             <w:shd w:fill="F1F5F9"/>
           </w:tcPr>
           <w:p>
             <w:r>
               <w:rPr>
+                <w:rFonts w:ascii="Arial" w:hAnsi="Arial"/>
                 <w:b/>
                 <w:color w:val="1E293B"/>
-                <w:sz w:val="19"/>
+                <w:sz w:val="18"/>
               </w:rPr>
-              <w:t>Diseño Universal para el Aprendizaje (DUA) y Adecuaciones:</w:t>
+              <w:t>Diseño Universal para el Aprendizaje (DUA CAST 2024):</w:t>
             </w:r>
           </w:p>
         </w:tc>
         <w:tc>
           <w:tcPr>
-            <w:tcW w:type="dxa" w:w="4680"/>
+            <w:tcW w:type="dxa" w:w="4968"/>
             <w:tcMar>
-              <w:top w:w="120" w:type="dxa"/>
-              <w:bottom w:w="120" w:type="dxa"/>
-              <w:left w:w="150" w:type="dxa"/>
-              <w:right w:w="150" w:type="dxa"/>
+              <w:top w:w="100" w:type="dxa"/>
+              <w:bottom w:w="100" w:type="dxa"/>
+              <w:left w:w="120" w:type="dxa"/>
+              <w:right w:w="120" w:type="dxa"/>
             </w:tcMar>
             <w:shd w:fill="FFFFFF"/>
           </w:tcPr>
           <w:p>
             <w:r>
               <w:rPr>
+                <w:rFonts w:ascii="Arial" w:hAnsi="Arial"/>
                 <w:color w:val="0F172A"/>
-                <w:sz w:val="19"/>
+                <w:sz w:val="18"/>
               </w:rPr>
               <w:t>[[ADAPTACIONES_DUA_INCLUSION]]</w:t>
             </w:r>
@@ -1307,21 +1683,22 @@
       <w:tr>
         <w:tc>
           <w:tcPr>
-            <w:tcW w:type="dxa" w:w="4680"/>
+            <w:tcW w:type="dxa" w:w="4968"/>
             <w:tcMar>
-              <w:top w:w="120" w:type="dxa"/>
-              <w:bottom w:w="120" w:type="dxa"/>
-              <w:left w:w="150" w:type="dxa"/>
-              <w:right w:w="150" w:type="dxa"/>
+              <w:top w:w="100" w:type="dxa"/>
+              <w:bottom w:w="100" w:type="dxa"/>
+              <w:left w:w="120" w:type="dxa"/>
+              <w:right w:w="120" w:type="dxa"/>
             </w:tcMar>
             <w:shd w:fill="F1F5F9"/>
           </w:tcPr>
           <w:p>
             <w:r>
               <w:rPr>
+                <w:rFonts w:ascii="Arial" w:hAnsi="Arial"/>
                 <w:b/>
                 <w:color w:val="1E293B"/>
-                <w:sz w:val="19"/>
+                <w:sz w:val="18"/>
               </w:rPr>
               <w:t>Estrategia Anti-Outsourcing y Triangulación Socrática:</w:t>
             </w:r>
@@ -1329,20 +1706,21 @@
         </w:tc>
         <w:tc>
           <w:tcPr>
-            <w:tcW w:type="dxa" w:w="4680"/>
+            <w:tcW w:type="dxa" w:w="4968"/>
             <w:tcMar>
-              <w:top w:w="120" w:type="dxa"/>
-              <w:bottom w:w="120" w:type="dxa"/>
-              <w:left w:w="150" w:type="dxa"/>
-              <w:right w:w="150" w:type="dxa"/>
+              <w:top w:w="100" w:type="dxa"/>
+              <w:bottom w:w="100" w:type="dxa"/>
+              <w:left w:w="120" w:type="dxa"/>
+              <w:right w:w="120" w:type="dxa"/>
             </w:tcMar>
             <w:shd w:fill="FFFFFF"/>
           </w:tcPr>
           <w:p>
             <w:r>
               <w:rPr>
+                <w:rFonts w:ascii="Arial" w:hAnsi="Arial"/>
                 <w:color w:val="0F172A"/>
-                <w:sz w:val="19"/>
+                <w:sz w:val="18"/>
               </w:rPr>
               <w:t>[[ESTRATEGIA_ANTI_OUTSOURCING]]</w:t>
             </w:r>
@@ -1354,6 +1732,7 @@
     <w:p>
       <w:r>
         <w:rPr>
+          <w:rFonts w:ascii="Arial" w:hAnsi="Arial"/>
           <w:b/>
           <w:color w:val="1E293B"/>
           <w:sz w:val="22"/>
@@ -1369,27 +1748,28 @@
         <w:tblLook w:firstColumn="1" w:firstRow="1" w:lastColumn="0" w:lastRow="0" w:noHBand="0" w:noVBand="1" w:val="04A0"/>
       </w:tblPr>
       <w:tblGrid>
-        <w:gridCol w:w="4680"/>
-        <w:gridCol w:w="4680"/>
+        <w:gridCol w:w="4968"/>
+        <w:gridCol w:w="4968"/>
       </w:tblGrid>
       <w:tr>
         <w:tc>
           <w:tcPr>
-            <w:tcW w:type="dxa" w:w="4680"/>
+            <w:tcW w:type="dxa" w:w="4968"/>
             <w:tcMar>
-              <w:top w:w="120" w:type="dxa"/>
-              <w:bottom w:w="120" w:type="dxa"/>
-              <w:left w:w="150" w:type="dxa"/>
-              <w:right w:w="150" w:type="dxa"/>
+              <w:top w:w="100" w:type="dxa"/>
+              <w:bottom w:w="100" w:type="dxa"/>
+              <w:left w:w="120" w:type="dxa"/>
+              <w:right w:w="120" w:type="dxa"/>
             </w:tcMar>
             <w:shd w:fill="FEF3C7"/>
           </w:tcPr>
           <w:p>
             <w:r>
               <w:rPr>
+                <w:rFonts w:ascii="Arial" w:hAnsi="Arial"/>
                 <w:b/>
                 <w:color w:val="B45309"/>
-                <w:sz w:val="19"/>
+                <w:sz w:val="18"/>
               </w:rPr>
               <w:t>Evidencia Auténtica Integradora:</w:t>
             </w:r>
@@ -1397,22 +1777,244 @@
         </w:tc>
         <w:tc>
           <w:tcPr>
-            <w:tcW w:type="dxa" w:w="4680"/>
+            <w:tcW w:type="dxa" w:w="4968"/>
             <w:tcMar>
-              <w:top w:w="120" w:type="dxa"/>
-              <w:bottom w:w="120" w:type="dxa"/>
-              <w:left w:w="150" w:type="dxa"/>
-              <w:right w:w="150" w:type="dxa"/>
+              <w:top w:w="100" w:type="dxa"/>
+              <w:bottom w:w="100" w:type="dxa"/>
+              <w:left w:w="120" w:type="dxa"/>
+              <w:right w:w="120" w:type="dxa"/>
             </w:tcMar>
             <w:shd w:fill="FFFFFF"/>
           </w:tcPr>
           <w:p>
             <w:r>
               <w:rPr>
+                <w:rFonts w:ascii="Arial" w:hAnsi="Arial"/>
                 <w:color w:val="0F172A"/>
-                <w:sz w:val="19"/>
+                <w:sz w:val="18"/>
               </w:rPr>
               <w:t>[[PRODUCTO_FINAL_MODULAR]]</w:t>
+            </w:r>
+          </w:p>
+        </w:tc>
+      </w:tr>
+    </w:tbl>
+    <w:p/>
+    <w:p>
+      <w:r>
+        <w:rPr>
+          <w:rFonts w:ascii="Arial" w:hAnsi="Arial"/>
+          <w:b/>
+          <w:color w:val="1E293B"/>
+          <w:sz w:val="22"/>
+        </w:rPr>
+        <w:t>6. FIRMAS DE APROBACIÓN Y ASEGURAMIENTO DE LA CALIDAD (ISO 21001)</w:t>
+      </w:r>
+    </w:p>
+    <w:tbl>
+      <w:tblPr>
+        <w:tblW w:type="auto" w:w="0"/>
+        <w:jc w:val="center"/>
+        <w:tblLayout w:type="fixed"/>
+        <w:tblLook w:firstColumn="1" w:firstRow="1" w:lastColumn="0" w:lastRow="0" w:noHBand="0" w:noVBand="1" w:val="04A0"/>
+      </w:tblPr>
+      <w:tblGrid>
+        <w:gridCol w:w="3312"/>
+        <w:gridCol w:w="3312"/>
+        <w:gridCol w:w="3312"/>
+      </w:tblGrid>
+      <w:tr>
+        <w:tc>
+          <w:tcPr>
+            <w:tcW w:type="dxa" w:w="3312"/>
+            <w:tcMar>
+              <w:top w:w="300" w:type="dxa"/>
+              <w:bottom w:w="60" w:type="dxa"/>
+              <w:left w:w="60" w:type="dxa"/>
+              <w:right w:w="60" w:type="dxa"/>
+            </w:tcMar>
+            <w:shd w:fill="FAFAFA"/>
+          </w:tcPr>
+          <w:p>
+            <w:pPr>
+              <w:jc w:val="center"/>
+            </w:pPr>
+            <w:r>
+              <w:rPr>
+                <w:rFonts w:ascii="Arial" w:hAnsi="Arial"/>
+                <w:color w:val="64748B"/>
+                <w:sz w:val="16"/>
+              </w:rPr>
+              <w:t>____________________________</w:t>
+              <w:br/>
+              <w:t>Firma y Sello</w:t>
+            </w:r>
+          </w:p>
+        </w:tc>
+        <w:tc>
+          <w:tcPr>
+            <w:tcW w:type="dxa" w:w="3312"/>
+            <w:tcMar>
+              <w:top w:w="300" w:type="dxa"/>
+              <w:bottom w:w="60" w:type="dxa"/>
+              <w:left w:w="60" w:type="dxa"/>
+              <w:right w:w="60" w:type="dxa"/>
+            </w:tcMar>
+            <w:shd w:fill="FAFAFA"/>
+          </w:tcPr>
+          <w:p>
+            <w:pPr>
+              <w:jc w:val="center"/>
+            </w:pPr>
+            <w:r>
+              <w:rPr>
+                <w:rFonts w:ascii="Arial" w:hAnsi="Arial"/>
+                <w:color w:val="64748B"/>
+                <w:sz w:val="16"/>
+              </w:rPr>
+              <w:t>____________________________</w:t>
+              <w:br/>
+              <w:t>Firma y Sello</w:t>
+            </w:r>
+          </w:p>
+        </w:tc>
+        <w:tc>
+          <w:tcPr>
+            <w:tcW w:type="dxa" w:w="3312"/>
+            <w:tcMar>
+              <w:top w:w="300" w:type="dxa"/>
+              <w:bottom w:w="60" w:type="dxa"/>
+              <w:left w:w="60" w:type="dxa"/>
+              <w:right w:w="60" w:type="dxa"/>
+            </w:tcMar>
+            <w:shd w:fill="FAFAFA"/>
+          </w:tcPr>
+          <w:p>
+            <w:pPr>
+              <w:jc w:val="center"/>
+            </w:pPr>
+            <w:r>
+              <w:rPr>
+                <w:rFonts w:ascii="Arial" w:hAnsi="Arial"/>
+                <w:color w:val="64748B"/>
+                <w:sz w:val="16"/>
+              </w:rPr>
+              <w:t>____________________________</w:t>
+              <w:br/>
+              <w:t>Firma y Sello</w:t>
+            </w:r>
+          </w:p>
+        </w:tc>
+      </w:tr>
+      <w:tr>
+        <w:tc>
+          <w:tcPr>
+            <w:tcW w:type="dxa" w:w="3312"/>
+            <w:tcMar>
+              <w:top w:w="40" w:type="dxa"/>
+              <w:bottom w:w="80" w:type="dxa"/>
+              <w:left w:w="60" w:type="dxa"/>
+              <w:right w:w="60" w:type="dxa"/>
+            </w:tcMar>
+            <w:shd w:fill="F1F5F9"/>
+          </w:tcPr>
+          <w:p>
+            <w:pPr>
+              <w:jc w:val="center"/>
+            </w:pPr>
+            <w:r>
+              <w:rPr>
+                <w:rFonts w:ascii="Arial" w:hAnsi="Arial"/>
+                <w:b/>
+                <w:color w:val="1E293B"/>
+                <w:sz w:val="16"/>
+              </w:rPr>
+              <w:t>DOCENTE TITULAR</w:t>
+              <w:br/>
+            </w:r>
+            <w:r>
+              <w:rPr>
+                <w:rFonts w:ascii="Arial" w:hAnsi="Arial"/>
+                <w:color w:val="64748B"/>
+                <w:sz w:val="14"/>
+              </w:rPr>
+              <w:t>[[DOCENTE]]</w:t>
+              <w:br/>
+              <w:t>(Elaboración y custodia de evidencias)</w:t>
+            </w:r>
+          </w:p>
+        </w:tc>
+        <w:tc>
+          <w:tcPr>
+            <w:tcW w:type="dxa" w:w="3312"/>
+            <w:tcMar>
+              <w:top w:w="40" w:type="dxa"/>
+              <w:bottom w:w="80" w:type="dxa"/>
+              <w:left w:w="60" w:type="dxa"/>
+              <w:right w:w="60" w:type="dxa"/>
+            </w:tcMar>
+            <w:shd w:fill="F1F5F9"/>
+          </w:tcPr>
+          <w:p>
+            <w:pPr>
+              <w:jc w:val="center"/>
+            </w:pPr>
+            <w:r>
+              <w:rPr>
+                <w:rFonts w:ascii="Arial" w:hAnsi="Arial"/>
+                <w:b/>
+                <w:color w:val="1E293B"/>
+                <w:sz w:val="16"/>
+              </w:rPr>
+              <w:t>COORDINACIÓN DE CARRERA</w:t>
+              <w:br/>
+            </w:r>
+            <w:r>
+              <w:rPr>
+                <w:rFonts w:ascii="Arial" w:hAnsi="Arial"/>
+                <w:color w:val="64748B"/>
+                <w:sz w:val="14"/>
+              </w:rPr>
+              <w:t>Comisión Curricular de Área</w:t>
+              <w:br/>
+              <w:t>(Revisión curricular y pertinencia)</w:t>
+            </w:r>
+          </w:p>
+        </w:tc>
+        <w:tc>
+          <w:tcPr>
+            <w:tcW w:type="dxa" w:w="3312"/>
+            <w:tcMar>
+              <w:top w:w="40" w:type="dxa"/>
+              <w:bottom w:w="80" w:type="dxa"/>
+              <w:left w:w="60" w:type="dxa"/>
+              <w:right w:w="60" w:type="dxa"/>
+            </w:tcMar>
+            <w:shd w:fill="F1F5F9"/>
+          </w:tcPr>
+          <w:p>
+            <w:pPr>
+              <w:jc w:val="center"/>
+            </w:pPr>
+            <w:r>
+              <w:rPr>
+                <w:rFonts w:ascii="Arial" w:hAnsi="Arial"/>
+                <w:b/>
+                <w:color w:val="1E293B"/>
+                <w:sz w:val="16"/>
+              </w:rPr>
+              <w:t>DIRECCIÓN ACADÉMICA / DECANATO</w:t>
+              <w:br/>
+            </w:r>
+            <w:r>
+              <w:rPr>
+                <w:rFonts w:ascii="Arial" w:hAnsi="Arial"/>
+                <w:color w:val="64748B"/>
+                <w:sz w:val="14"/>
+              </w:rPr>
+              <w:t>Dirección de Calidad Académica</w:t>
+              <w:br/>
+              <w:t>(Aprobación oficial institucional)</w:t>
             </w:r>
           </w:p>
         </w:tc>
@@ -1425,21 +2027,62 @@
       </w:pPr>
       <w:r>
         <w:rPr>
+          <w:rFonts w:ascii="Arial" w:hAnsi="Arial"/>
           <w:i/>
           <w:color w:val="64748B"/>
           <w:sz w:val="15"/>
         </w:rPr>
-        <w:t>Generado automáticamente por el Motor de Planificación Modular • Carpeta Pedagógica 2.0</w:t>
+        <w:t>Generado automáticamente por el Motor de Planificación Modular CBL • Carpeta Pedagógica 2.0 • ISO 21001:2018</w:t>
       </w:r>
     </w:p>
     <w:sectPr>
+      <w:headerReference w:type="default" r:id="rId9"/>
+      <w:footerReference w:type="default" r:id="rId10"/>
       <w:pgSz w:w="12240" w:h="15840"/>
-      <w:pgMar w:top="1440" w:right="1440" w:bottom="1440" w:left="1440" w:header="720" w:footer="720" w:gutter="0"/>
+      <w:pgMar w:top="1152" w:right="1152" w:bottom="1152" w:left="1152" w:header="720" w:footer="720" w:gutter="0"/>
       <w:cols w:space="720"/>
       <w:docGrid w:linePitch="360"/>
     </w:sectPr>
   </w:body>
 </w:document>
+</file>
+
+<file path=word/footer1.xml><?xml version="1.0" encoding="utf-8"?>
+<w:ftr xmlns:m="http://schemas.openxmlformats.org/officeDocument/2006/math" xmlns:mc="http://schemas.openxmlformats.org/markup-compatibility/2006" xmlns:mo="http://schemas.microsoft.com/office/mac/office/2008/main" xmlns:mv="urn:schemas-microsoft-com:mac:vml" xmlns:o="urn:schemas-microsoft-com:office:office" xmlns:r="http://schemas.openxmlformats.org/officeDocument/2006/relationships" xmlns:v="urn:schemas-microsoft-com:vml" xmlns:w10="urn:schemas-microsoft-com:office:word" xmlns:w14="http://schemas.microsoft.com/office/word/2010/wordml" xmlns:w="http://schemas.openxmlformats.org/wordprocessingml/2006/main" xmlns:wne="http://schemas.microsoft.com/office/word/2006/wordml" xmlns:wp14="http://schemas.microsoft.com/office/word/2010/wordprocessingDrawing" xmlns:wp="http://schemas.openxmlformats.org/drawingml/2006/wordprocessingDrawing" xmlns:wpc="http://schemas.microsoft.com/office/word/2010/wordprocessingCanvas" xmlns:wpg="http://schemas.microsoft.com/office/word/2010/wordprocessingGroup" xmlns:wpi="http://schemas.microsoft.com/office/word/2010/wordprocessingInk" xmlns:wps="http://schemas.microsoft.com/office/word/2010/wordprocessingShape" mc:Ignorable="w14 wp14">
+  <w:p>
+    <w:pPr>
+      <w:pStyle w:val="Footer"/>
+      <w:jc w:val="left"/>
+    </w:pPr>
+    <w:r>
+      <w:rPr>
+        <w:rFonts w:ascii="Arial" w:hAnsi="Arial"/>
+        <w:color w:val="64748B"/>
+        <w:sz w:val="15"/>
+      </w:rPr>
+      <w:t>Carpeta Pedagógica 2.0 • Sistema de Calidad Curricular • DOC-DIR-CP2-PDC-[[CODIGO_MODULO]]</w:t>
+    </w:r>
+  </w:p>
+</w:ftr>
+</file>
+
+<file path=word/header1.xml><?xml version="1.0" encoding="utf-8"?>
+<w:hdr xmlns:m="http://schemas.openxmlformats.org/officeDocument/2006/math" xmlns:mc="http://schemas.openxmlformats.org/markup-compatibility/2006" xmlns:mo="http://schemas.microsoft.com/office/mac/office/2008/main" xmlns:mv="urn:schemas-microsoft-com:mac:vml" xmlns:o="urn:schemas-microsoft-com:office:office" xmlns:r="http://schemas.openxmlformats.org/officeDocument/2006/relationships" xmlns:v="urn:schemas-microsoft-com:vml" xmlns:w10="urn:schemas-microsoft-com:office:word" xmlns:w14="http://schemas.microsoft.com/office/word/2010/wordml" xmlns:w="http://schemas.openxmlformats.org/wordprocessingml/2006/main" xmlns:wne="http://schemas.microsoft.com/office/word/2006/wordml" xmlns:wp14="http://schemas.microsoft.com/office/word/2010/wordprocessingDrawing" xmlns:wp="http://schemas.openxmlformats.org/drawingml/2006/wordprocessingDrawing" xmlns:wpc="http://schemas.microsoft.com/office/word/2010/wordprocessingCanvas" xmlns:wpg="http://schemas.microsoft.com/office/word/2010/wordprocessingGroup" xmlns:wpi="http://schemas.microsoft.com/office/word/2010/wordprocessingInk" xmlns:wps="http://schemas.microsoft.com/office/word/2010/wordprocessingShape" mc:Ignorable="w14 wp14">
+  <w:p>
+    <w:pPr>
+      <w:pStyle w:val="Header"/>
+      <w:jc w:val="right"/>
+    </w:pPr>
+    <w:r>
+      <w:rPr>
+        <w:rFonts w:ascii="Arial" w:hAnsi="Arial"/>
+        <w:color w:val="64748B"/>
+        <w:sz w:val="15"/>
+      </w:rPr>
+      <w:t>PLAN DE APRENDIZAJE MODULAR (CBL) • [[CODIGO_MODULO]] • ISO 21001:2018</w:t>
+    </w:r>
+  </w:p>
+</w:hdr>
 </file>
 
 <file path=word/numbering.xml><?xml version="1.0" encoding="utf-8"?>

</xml_diff>